<commit_message>
Word book: switch to blue + Nourix gold palette
Co-Authored-By: Claude Opus 5.5 <noreply@anthropic.com>
Claude-Session: https://claude.ai/code/session_0119EEHr9PMFFRyRJjMJGbmM
</commit_message>
<xml_diff>
--- a/docs/word-book/Word-Nourix-Academy.docx
+++ b/docs/word-book/Word-Nourix-Academy.docx
@@ -327,7 +327,7 @@
             <w:rPr>
               <w:b/>
               <w:bCs/>
-              <w:color w:val="A67C2E"/>
+              <w:color w:val="2B579A"/>
               <w:rtl/>
             </w:rPr>
             <w:t xml:space="preserve">الجزء الأول: البداية</w:t>
@@ -336,7 +336,7 @@
             <w:rPr>
               <w:b/>
               <w:bCs/>
-              <w:color w:val="A67C2E"/>
+              <w:color w:val="2B579A"/>
               <w:rtl/>
             </w:rPr>
             <w:tab/>
@@ -345,7 +345,7 @@
             <w:rPr>
               <w:b/>
               <w:bCs/>
-              <w:color w:val="A67C2E"/>
+              <w:color w:val="2B579A"/>
               <w:rtl/>
             </w:rPr>
             <w:t>6</w:t>
@@ -451,7 +451,7 @@
             <w:rPr>
               <w:b/>
               <w:bCs/>
-              <w:color w:val="A67C2E"/>
+              <w:color w:val="2B579A"/>
               <w:rtl/>
             </w:rPr>
             <w:t xml:space="preserve">الجزء الثاني: التنسيق</w:t>
@@ -460,7 +460,7 @@
             <w:rPr>
               <w:b/>
               <w:bCs/>
-              <w:color w:val="A67C2E"/>
+              <w:color w:val="2B579A"/>
               <w:rtl/>
             </w:rPr>
             <w:tab/>
@@ -469,7 +469,7 @@
             <w:rPr>
               <w:b/>
               <w:bCs/>
-              <w:color w:val="A67C2E"/>
+              <w:color w:val="2B579A"/>
               <w:rtl/>
             </w:rPr>
             <w:t>17</w:t>
@@ -604,7 +604,7 @@
             <w:rPr>
               <w:b/>
               <w:bCs/>
-              <w:color w:val="A67C2E"/>
+              <w:color w:val="2B579A"/>
               <w:rtl/>
             </w:rPr>
             <w:t xml:space="preserve">الجزء الثالث: الإثراء</w:t>
@@ -613,7 +613,7 @@
             <w:rPr>
               <w:b/>
               <w:bCs/>
-              <w:color w:val="A67C2E"/>
+              <w:color w:val="2B579A"/>
               <w:rtl/>
             </w:rPr>
             <w:tab/>
@@ -622,7 +622,7 @@
             <w:rPr>
               <w:b/>
               <w:bCs/>
-              <w:color w:val="A67C2E"/>
+              <w:color w:val="2B579A"/>
               <w:rtl/>
             </w:rPr>
             <w:t>29</w:t>
@@ -728,7 +728,7 @@
             <w:rPr>
               <w:b/>
               <w:bCs/>
-              <w:color w:val="A67C2E"/>
+              <w:color w:val="2B579A"/>
               <w:rtl/>
             </w:rPr>
             <w:t xml:space="preserve">الجزء الرابع: الاحتراف</w:t>
@@ -737,7 +737,7 @@
             <w:rPr>
               <w:b/>
               <w:bCs/>
-              <w:color w:val="A67C2E"/>
+              <w:color w:val="2B579A"/>
               <w:rtl/>
             </w:rPr>
             <w:tab/>
@@ -746,7 +746,7 @@
             <w:rPr>
               <w:b/>
               <w:bCs/>
-              <w:color w:val="A67C2E"/>
+              <w:color w:val="2B579A"/>
               <w:rtl/>
             </w:rPr>
             <w:t>38</w:t>
@@ -852,7 +852,7 @@
             <w:rPr>
               <w:b/>
               <w:bCs/>
-              <w:color w:val="A67C2E"/>
+              <w:color w:val="2B579A"/>
               <w:rtl/>
             </w:rPr>
             <w:t xml:space="preserve">الجزء الخامس: التطبيق</w:t>
@@ -861,7 +861,7 @@
             <w:rPr>
               <w:b/>
               <w:bCs/>
-              <w:color w:val="A67C2E"/>
+              <w:color w:val="2B579A"/>
               <w:rtl/>
             </w:rPr>
             <w:tab/>
@@ -870,7 +870,7 @@
             <w:rPr>
               <w:b/>
               <w:bCs/>
-              <w:color w:val="A67C2E"/>
+              <w:color w:val="2B579A"/>
               <w:rtl/>
             </w:rPr>
             <w:t>48</w:t>
@@ -34931,42 +34931,42 @@
     </w:pPr>
     <w:r>
       <w:rPr>
-        <w:color w:val="8A7E62"/>
+        <w:color w:val="5B6B85"/>
         <w:sz w:val="18"/>
       </w:rPr>
       <w:t xml:space="preserve">Word من الصفر إلى الاحتراف  ·  Nourix Academy  ·  </w:t>
     </w:r>
     <w:r>
       <w:rPr>
-        <w:color w:val="8A7E62"/>
+        <w:color w:val="5B6B85"/>
         <w:sz w:val="18"/>
       </w:rPr>
       <w:fldChar w:fldCharType="begin"/>
     </w:r>
     <w:r>
       <w:rPr>
-        <w:color w:val="8A7E62"/>
+        <w:color w:val="5B6B85"/>
         <w:sz w:val="18"/>
       </w:rPr>
       <w:instrText xml:space="preserve"> PAGE </w:instrText>
     </w:r>
     <w:r>
       <w:rPr>
-        <w:color w:val="8A7E62"/>
+        <w:color w:val="5B6B85"/>
         <w:sz w:val="18"/>
       </w:rPr>
       <w:fldChar w:fldCharType="separate"/>
     </w:r>
     <w:r>
       <w:rPr>
-        <w:color w:val="8A7E62"/>
+        <w:color w:val="5B6B85"/>
         <w:sz w:val="18"/>
       </w:rPr>
       <w:t>1</w:t>
     </w:r>
     <w:r>
       <w:rPr>
-        <w:color w:val="8A7E62"/>
+        <w:color w:val="5B6B85"/>
         <w:sz w:val="18"/>
       </w:rPr>
       <w:fldChar w:fldCharType="end"/>
@@ -36190,7 +36190,7 @@
     <w:rPr>
       <w:b/>
       <w:bCs/>
-      <w:color w:val="15110A"/>
+      <w:color w:val="0F2747"/>
       <w:sz w:val="56"/>
       <w:szCs w:val="56"/>
     </w:rPr>
@@ -36329,7 +36329,7 @@
     <w:rPr>
       <w:b/>
       <w:bCs/>
-      <w:color w:val="15110A"/>
+      <w:color w:val="0F2747"/>
       <w:sz w:val="44"/>
       <w:szCs w:val="44"/>
     </w:rPr>
@@ -36352,7 +36352,7 @@
     <w:rPr>
       <w:b/>
       <w:bCs/>
-      <w:color w:val="A67C2E"/>
+      <w:color w:val="2B579A"/>
       <w:sz w:val="32"/>
       <w:szCs w:val="32"/>
     </w:rPr>
@@ -36375,7 +36375,7 @@
     <w:rPr>
       <w:b/>
       <w:bCs/>
-      <w:color w:val="3A2F18"/>
+      <w:color w:val="1E3A66"/>
       <w:sz w:val="28"/>
       <w:szCs w:val="28"/>
     </w:rPr>
@@ -36643,7 +36643,7 @@
         <w:left w:val="single" w:sz="24" w:space="8" w:color="D4A84B"/>
         <w:right w:val="single" w:sz="24" w:space="8" w:color="D4A84B"/>
       </w:pBdr>
-      <w:shd w:val="clear" w:color="auto" w:fill="FAF5E8"/>
+      <w:shd w:val="clear" w:color="auto" w:fill="EEF3FA"/>
       <w:spacing w:before="0" w:after="0"/>
       <w:ind w:left="200" w:right="200"/>
     </w:pPr>
@@ -36686,12 +36686,12 @@
     </w:rPr>
     <w:tblPr>
       <w:tblBorders>
-        <w:top w:val="single" w:sz="4" w:color="D9CBA3"/>
-        <w:left w:val="single" w:sz="4" w:color="D9CBA3"/>
-        <w:bottom w:val="single" w:sz="4" w:color="D9CBA3"/>
-        <w:right w:val="single" w:sz="4" w:color="D9CBA3"/>
-        <w:insideH w:val="single" w:sz="4" w:color="D9CBA3"/>
-        <w:insideV w:val="single" w:sz="4" w:color="D9CBA3"/>
+        <w:top w:val="single" w:sz="4" w:color="C5D3E8"/>
+        <w:left w:val="single" w:sz="4" w:color="C5D3E8"/>
+        <w:bottom w:val="single" w:sz="4" w:color="C5D3E8"/>
+        <w:right w:val="single" w:sz="4" w:color="C5D3E8"/>
+        <w:insideH w:val="single" w:sz="4" w:color="C5D3E8"/>
+        <w:insideV w:val="single" w:sz="4" w:color="C5D3E8"/>
       </w:tblBorders>
       <w:tblCellMar>
         <w:top w:w="60" w:type="dxa"/>
@@ -36707,7 +36707,7 @@
         <w:color w:val="F0D58C"/>
       </w:rPr>
       <w:tcPr>
-        <w:shd w:val="clear" w:color="auto" w:fill="15110A"/>
+        <w:shd w:val="clear" w:color="auto" w:fill="0F2747"/>
       </w:tcPr>
     </w:tblStylePr>
   </w:style>
@@ -36756,7 +36756,7 @@
     <w:rPr>
       <w:i/>
       <w:iCs/>
-      <w:color w:val="8A7E62"/>
+      <w:color w:val="5B6B85"/>
       <w:sz w:val="20"/>
       <w:szCs w:val="22"/>
     </w:rPr>
@@ -36819,7 +36819,7 @@
     <w:rPr>
       <w:b/>
       <w:bCs/>
-      <w:color w:val="15110A"/>
+      <w:color w:val="0F2747"/>
       <w:sz w:val="44"/>
       <w:szCs w:val="44"/>
     </w:rPr>
@@ -36844,14 +36844,14 @@
       <w:pBdr>
         <w:right w:val="single" w:sz="18" w:space="6" w:color="D4A84B"/>
       </w:pBdr>
-      <w:shd w:val="clear" w:color="auto" w:fill="FAF5E8"/>
+      <w:shd w:val="clear" w:color="auto" w:fill="EEF3FA"/>
       <w:spacing w:before="0" w:after="0" w:line="252" w:lineRule="auto"/>
       <w:ind w:left="300" w:right="300"/>
     </w:pPr>
     <w:rPr>
       <w:sz w:val="20"/>
       <w:szCs w:val="22"/>
-      <w:color w:val="1C170E"/>
+      <w:color w:val="1A2433"/>
     </w:rPr>
   </w:style>
   <w:style w:type="paragraph" w:customStyle="1" w:styleId="ShotCaption">
@@ -36865,7 +36865,7 @@
     <w:rPr>
       <w:b/>
       <w:bCs/>
-      <w:color w:val="A67C2E"/>
+      <w:color w:val="2B579A"/>
       <w:sz w:val="20"/>
       <w:szCs w:val="22"/>
     </w:rPr>
@@ -36881,7 +36881,7 @@
     <w:rPr>
       <w:i/>
       <w:iCs/>
-      <w:color w:val="A67C2E"/>
+      <w:color w:val="2B579A"/>
       <w:sz w:val="24"/>
       <w:szCs w:val="24"/>
     </w:rPr>
@@ -36892,10 +36892,10 @@
     <w:link w:val="VerbatimChar"/>
     <w:pPr>
       <w:pBdr>
-        <w:top w:val="single" w:sz="4" w:space="4" w:color="D9CBA3"/>
-        <w:left w:val="single" w:sz="4" w:space="4" w:color="D9CBA3"/>
-        <w:bottom w:val="single" w:sz="4" w:space="4" w:color="D9CBA3"/>
-        <w:right w:val="single" w:sz="4" w:space="4" w:color="D9CBA3"/>
+        <w:top w:val="single" w:sz="4" w:space="4" w:color="C5D3E8"/>
+        <w:left w:val="single" w:sz="4" w:space="4" w:color="C5D3E8"/>
+        <w:bottom w:val="single" w:sz="4" w:space="4" w:color="C5D3E8"/>
+        <w:right w:val="single" w:sz="4" w:space="4" w:color="C5D3E8"/>
       </w:pBdr>
       <w:shd w:val="clear" w:color="auto" w:fill="F1F5F9"/>
       <w:wordWrap w:val="on"/>

</xml_diff>